<commit_message>
modif pour considérer la table conso_compo d'Avril 2025 av mise à jour d'Agribalyse
</commit_message>
<xml_diff>
--- a/ReadMe.docx
+++ b/ReadMe.docx
@@ -176,8 +176,50 @@
       </w:r>
     </w:p>
     <w:p>
-      <w:r>
-        <w:t>Tables out : app_nut_indiv (.csv et .xlsx), n = 8 104 (2 lignes par individus, apports avec ou sans alcool)</w:t>
+      <w:pPr>
+        <w:rPr>
+          <w:b/>
+          <w:bCs/>
+        </w:rPr>
+      </w:pPr>
+      <w:r>
+        <w:rPr>
+          <w:b/>
+          <w:bCs/>
+        </w:rPr>
+        <w:t>ATTENTION, 2 bases différentes, une à partir de conso_compo_FEV_2025 et l’autre de la base conso_compo d’Avril 2025 suite à la mise à jour des variables environnementales</w:t>
+      </w:r>
+    </w:p>
+    <w:p>
+      <w:r>
+        <w:t>Tables out : app_nut_indiv</w:t>
+      </w:r>
+      <w:r>
+        <w:t>_FEV2025</w:t>
+      </w:r>
+      <w:r>
+        <w:t xml:space="preserve"> </w:t>
+      </w:r>
+      <w:r>
+        <w:t xml:space="preserve">ET </w:t>
+      </w:r>
+      <w:r>
+        <w:t>app_nut_indiv_</w:t>
+      </w:r>
+      <w:r>
+        <w:t>AVRIL</w:t>
+      </w:r>
+      <w:r>
+        <w:t xml:space="preserve">2025 </w:t>
+      </w:r>
+      <w:r>
+        <w:t xml:space="preserve"> </w:t>
+      </w:r>
+      <w:r>
+        <w:t>(.csv et .xlsx), n = 8 104 (2 lignes par individus, apports avec ou sans alcool)</w:t>
+      </w:r>
+      <w:r>
+        <w:t>. La différence entre les deux tables est sur les variables environnementales.</w:t>
       </w:r>
     </w:p>
     <w:p>
@@ -293,6 +335,7 @@
     </w:p>
     <w:p>
       <w:r>
+        <w:lastRenderedPageBreak/>
         <w:t xml:space="preserve">Nutriments particuliers : </w:t>
       </w:r>
     </w:p>
@@ -329,7 +372,6 @@
         </w:numPr>
       </w:pPr>
       <w:r>
-        <w:lastRenderedPageBreak/>
         <w:t>Pour le calcium, reco de 9</w:t>
       </w:r>
       <w:r>
@@ -2039,9 +2081,12 @@
   </w:compat>
   <w:rsids>
     <w:rsidRoot w:val="005C5EC7"/>
+    <w:rsid w:val="004A0A77"/>
     <w:rsid w:val="005C5EC7"/>
+    <w:rsid w:val="00703DC8"/>
     <w:rsid w:val="00716FD6"/>
     <w:rsid w:val="00772397"/>
+    <w:rsid w:val="00DC0608"/>
   </w:rsids>
   <m:mathPr>
     <m:mathFont m:val="Cambria Math"/>

</xml_diff>